<commit_message>
Cambios en la capacidad de servicios
</commit_message>
<xml_diff>
--- a/Documentos/Documentacion_Tecnica.docx
+++ b/Documentos/Documentacion_Tecnica.docx
@@ -327,56 +327,56 @@
           <w:rFonts w:ascii="Segoe UI Emoji" w:eastAsia="Segoe UI Emoji" w:hAnsi="Segoe UI Emoji" w:cs="Segoe UI Emoji"/>
           <w:lang w:val="es-ES"/>
         </w:rPr>
-        <w:t xml:space="preserve"> Navarro Marín, Helmer Murillo</w:t>
-      </w:r>
+        <w:t xml:space="preserve"> Navarro Marín, </w:t>
+      </w:r>
+      <w:proofErr w:type="spellStart"/>
       <w:r>
         <w:rPr>
           <w:rFonts w:ascii="Segoe UI Emoji" w:eastAsia="Segoe UI Emoji" w:hAnsi="Segoe UI Emoji" w:cs="Segoe UI Emoji"/>
           <w:lang w:val="es-ES"/>
         </w:rPr>
-        <w:t>, Juan Jose Ramirez</w:t>
-      </w:r>
-      <w:r>
-        <w:rPr>
-          <w:lang w:val="es-CO"/>
-        </w:rPr>
-        <w:br/>
-      </w:r>
+        <w:t>Helmer</w:t>
+      </w:r>
+      <w:proofErr w:type="spellEnd"/>
       <w:r>
         <w:rPr>
           <w:rFonts w:ascii="Segoe UI Emoji" w:eastAsia="Segoe UI Emoji" w:hAnsi="Segoe UI Emoji" w:cs="Segoe UI Emoji"/>
           <w:lang w:val="es-ES"/>
         </w:rPr>
-        <w:t xml:space="preserve"> ID: </w:t>
+        <w:t xml:space="preserve"> Murillo</w:t>
       </w:r>
       <w:r>
         <w:rPr>
           <w:rFonts w:ascii="Segoe UI Emoji" w:eastAsia="Segoe UI Emoji" w:hAnsi="Segoe UI Emoji" w:cs="Segoe UI Emoji"/>
           <w:lang w:val="es-ES"/>
         </w:rPr>
-        <w:t>00050841,</w:t>
-      </w:r>
+        <w:t xml:space="preserve">, Juan </w:t>
+      </w:r>
+      <w:proofErr w:type="spellStart"/>
       <w:r>
         <w:rPr>
           <w:rFonts w:ascii="Segoe UI Emoji" w:eastAsia="Segoe UI Emoji" w:hAnsi="Segoe UI Emoji" w:cs="Segoe UI Emoji"/>
           <w:lang w:val="es-ES"/>
         </w:rPr>
-        <w:t xml:space="preserve"> </w:t>
-      </w:r>
+        <w:t>Jose</w:t>
+      </w:r>
+      <w:proofErr w:type="spellEnd"/>
       <w:r>
         <w:rPr>
           <w:rFonts w:ascii="Segoe UI Emoji" w:eastAsia="Segoe UI Emoji" w:hAnsi="Segoe UI Emoji" w:cs="Segoe UI Emoji"/>
           <w:lang w:val="es-ES"/>
         </w:rPr>
-        <w:t>000523447</w:t>
-      </w:r>
+        <w:t xml:space="preserve"> </w:t>
+      </w:r>
+      <w:proofErr w:type="spellStart"/>
       <w:r>
         <w:rPr>
           <w:rFonts w:ascii="Segoe UI Emoji" w:eastAsia="Segoe UI Emoji" w:hAnsi="Segoe UI Emoji" w:cs="Segoe UI Emoji"/>
           <w:lang w:val="es-ES"/>
         </w:rPr>
-        <w:t>, 000519218</w:t>
-      </w:r>
+        <w:t>Ramirez</w:t>
+      </w:r>
+      <w:proofErr w:type="spellEnd"/>
       <w:r>
         <w:rPr>
           <w:lang w:val="es-CO"/>
@@ -388,40 +388,81 @@
           <w:rFonts w:ascii="Segoe UI Emoji" w:eastAsia="Segoe UI Emoji" w:hAnsi="Segoe UI Emoji" w:cs="Segoe UI Emoji"/>
           <w:lang w:val="es-ES"/>
         </w:rPr>
-        <w:t xml:space="preserve"> Curso: </w:t>
+        <w:t xml:space="preserve"> ID: </w:t>
       </w:r>
       <w:r>
         <w:rPr>
           <w:rFonts w:ascii="Segoe UI Emoji" w:eastAsia="Segoe UI Emoji" w:hAnsi="Segoe UI Emoji" w:cs="Segoe UI Emoji"/>
           <w:lang w:val="es-ES"/>
         </w:rPr>
-        <w:t xml:space="preserve">Proyecto </w:t>
+        <w:t>00050841,</w:t>
       </w:r>
       <w:r>
         <w:rPr>
           <w:rFonts w:ascii="Segoe UI Emoji" w:eastAsia="Segoe UI Emoji" w:hAnsi="Segoe UI Emoji" w:cs="Segoe UI Emoji"/>
           <w:lang w:val="es-ES"/>
         </w:rPr>
-        <w:t xml:space="preserve">Aplicado </w:t>
+        <w:t xml:space="preserve"> </w:t>
       </w:r>
       <w:r>
         <w:rPr>
           <w:rFonts w:ascii="Segoe UI Emoji" w:eastAsia="Segoe UI Emoji" w:hAnsi="Segoe UI Emoji" w:cs="Segoe UI Emoji"/>
           <w:lang w:val="es-ES"/>
         </w:rPr>
-        <w:t>TIC 1</w:t>
-      </w:r>
-      <w:r>
-        <w:rPr>
-          <w:lang w:val="es-CO"/>
-        </w:rPr>
-        <w:br/>
+        <w:t>000523447</w:t>
       </w:r>
       <w:r>
         <w:rPr>
           <w:rFonts w:ascii="Segoe UI Emoji" w:eastAsia="Segoe UI Emoji" w:hAnsi="Segoe UI Emoji" w:cs="Segoe UI Emoji"/>
           <w:lang w:val="es-ES"/>
         </w:rPr>
+        <w:t>, 000519218</w:t>
+      </w:r>
+      <w:r>
+        <w:rPr>
+          <w:lang w:val="es-CO"/>
+        </w:rPr>
+        <w:br/>
+      </w:r>
+      <w:r>
+        <w:rPr>
+          <w:rFonts w:ascii="Segoe UI Emoji" w:eastAsia="Segoe UI Emoji" w:hAnsi="Segoe UI Emoji" w:cs="Segoe UI Emoji"/>
+          <w:lang w:val="es-ES"/>
+        </w:rPr>
+        <w:t xml:space="preserve"> Curso: </w:t>
+      </w:r>
+      <w:r>
+        <w:rPr>
+          <w:rFonts w:ascii="Segoe UI Emoji" w:eastAsia="Segoe UI Emoji" w:hAnsi="Segoe UI Emoji" w:cs="Segoe UI Emoji"/>
+          <w:lang w:val="es-ES"/>
+        </w:rPr>
+        <w:t xml:space="preserve">Proyecto </w:t>
+      </w:r>
+      <w:r>
+        <w:rPr>
+          <w:rFonts w:ascii="Segoe UI Emoji" w:eastAsia="Segoe UI Emoji" w:hAnsi="Segoe UI Emoji" w:cs="Segoe UI Emoji"/>
+          <w:lang w:val="es-ES"/>
+        </w:rPr>
+        <w:t xml:space="preserve">Aplicado </w:t>
+      </w:r>
+      <w:r>
+        <w:rPr>
+          <w:rFonts w:ascii="Segoe UI Emoji" w:eastAsia="Segoe UI Emoji" w:hAnsi="Segoe UI Emoji" w:cs="Segoe UI Emoji"/>
+          <w:lang w:val="es-ES"/>
+        </w:rPr>
+        <w:t>TIC 1</w:t>
+      </w:r>
+      <w:r>
+        <w:rPr>
+          <w:lang w:val="es-CO"/>
+        </w:rPr>
+        <w:br/>
+      </w:r>
+      <w:r>
+        <w:rPr>
+          <w:rFonts w:ascii="Segoe UI Emoji" w:eastAsia="Segoe UI Emoji" w:hAnsi="Segoe UI Emoji" w:cs="Segoe UI Emoji"/>
+          <w:lang w:val="es-ES"/>
+        </w:rPr>
         <w:t xml:space="preserve"> Docente: </w:t>
       </w:r>
       <w:r>
@@ -429,7 +470,23 @@
           <w:rFonts w:ascii="Segoe UI Emoji" w:eastAsia="Segoe UI Emoji" w:hAnsi="Segoe UI Emoji" w:cs="Segoe UI Emoji"/>
           <w:lang w:val="es-CO"/>
         </w:rPr>
-        <w:t>Gloria Liliana Velez Saldarriaga</w:t>
+        <w:t xml:space="preserve">Gloria Liliana </w:t>
+      </w:r>
+      <w:proofErr w:type="spellStart"/>
+      <w:r>
+        <w:rPr>
+          <w:rFonts w:ascii="Segoe UI Emoji" w:eastAsia="Segoe UI Emoji" w:hAnsi="Segoe UI Emoji" w:cs="Segoe UI Emoji"/>
+          <w:lang w:val="es-CO"/>
+        </w:rPr>
+        <w:t>Velez</w:t>
+      </w:r>
+      <w:proofErr w:type="spellEnd"/>
+      <w:r>
+        <w:rPr>
+          <w:rFonts w:ascii="Segoe UI Emoji" w:eastAsia="Segoe UI Emoji" w:hAnsi="Segoe UI Emoji" w:cs="Segoe UI Emoji"/>
+          <w:lang w:val="es-CO"/>
+        </w:rPr>
+        <w:t xml:space="preserve"> Saldarriaga</w:t>
       </w:r>
       <w:r>
         <w:rPr>
@@ -1177,7 +1234,21 @@
         <w:rPr>
           <w:lang w:val="es-CO"/>
         </w:rPr>
-        <w:t xml:space="preserve"> integrados (ERP), loT y </w:t>
+        <w:t xml:space="preserve"> integrados (ERP), </w:t>
+      </w:r>
+      <w:proofErr w:type="spellStart"/>
+      <w:r>
+        <w:rPr>
+          <w:lang w:val="es-CO"/>
+        </w:rPr>
+        <w:t>loT</w:t>
+      </w:r>
+      <w:proofErr w:type="spellEnd"/>
+      <w:r>
+        <w:rPr>
+          <w:lang w:val="es-CO"/>
+        </w:rPr>
+        <w:t xml:space="preserve"> y </w:t>
       </w:r>
       <w:r>
         <w:rPr>
@@ -3372,7 +3443,29 @@
           <w:szCs w:val="22"/>
           <w:lang w:val="es-MX"/>
         </w:rPr>
-        <w:t>API (Application Programming Interface) Una API es un conjunto de reglas y protocolos que permite que diferentes aplicaciones se comuniquen entre sí</w:t>
+        <w:t xml:space="preserve">API (Application Programming </w:t>
+      </w:r>
+      <w:proofErr w:type="gramStart"/>
+      <w:r>
+        <w:rPr>
+          <w:rFonts w:ascii="Aptos" w:eastAsia="Aptos" w:hAnsi="Aptos" w:cs="Aptos"/>
+          <w:color w:val="000000" w:themeColor="text1"/>
+          <w:sz w:val="22"/>
+          <w:szCs w:val="22"/>
+          <w:lang w:val="es-MX"/>
+        </w:rPr>
+        <w:t>Interface</w:t>
+      </w:r>
+      <w:proofErr w:type="gramEnd"/>
+      <w:r>
+        <w:rPr>
+          <w:rFonts w:ascii="Aptos" w:eastAsia="Aptos" w:hAnsi="Aptos" w:cs="Aptos"/>
+          <w:color w:val="000000" w:themeColor="text1"/>
+          <w:sz w:val="22"/>
+          <w:szCs w:val="22"/>
+          <w:lang w:val="es-MX"/>
+        </w:rPr>
+        <w:t>) Una API es un conjunto de reglas y protocolos que permite que diferentes aplicaciones se comuniquen entre sí</w:t>
       </w:r>
     </w:p>
     <w:p>
@@ -3428,7 +3521,29 @@
           <w:szCs w:val="22"/>
           <w:lang w:val="es-MX"/>
         </w:rPr>
-        <w:t>Autenticación y Autorización Autenticación: Verificación de la identidad del usuario (ej: login con usuario y contraseña).</w:t>
+        <w:t xml:space="preserve">Autenticación y Autorización Autenticación: Verificación de la identidad del usuario (ej: </w:t>
+      </w:r>
+      <w:proofErr w:type="spellStart"/>
+      <w:r>
+        <w:rPr>
+          <w:rFonts w:ascii="Aptos" w:eastAsia="Aptos" w:hAnsi="Aptos" w:cs="Aptos"/>
+          <w:color w:val="000000" w:themeColor="text1"/>
+          <w:sz w:val="22"/>
+          <w:szCs w:val="22"/>
+          <w:lang w:val="es-MX"/>
+        </w:rPr>
+        <w:t>login</w:t>
+      </w:r>
+      <w:proofErr w:type="spellEnd"/>
+      <w:r>
+        <w:rPr>
+          <w:rFonts w:ascii="Aptos" w:eastAsia="Aptos" w:hAnsi="Aptos" w:cs="Aptos"/>
+          <w:color w:val="000000" w:themeColor="text1"/>
+          <w:sz w:val="22"/>
+          <w:szCs w:val="22"/>
+          <w:lang w:val="es-MX"/>
+        </w:rPr>
+        <w:t xml:space="preserve"> con usuario y contraseña).</w:t>
       </w:r>
     </w:p>
     <w:p>
@@ -3512,7 +3627,29 @@
           <w:szCs w:val="22"/>
           <w:lang w:val="es-MX"/>
         </w:rPr>
-        <w:t xml:space="preserve">Metodología de Desarrollo Scrum: Marco de trabajo ágil para gestionar el desarrollo iterativo y incremental, con </w:t>
+        <w:t xml:space="preserve">Metodología de Desarrollo Scrum: Marco de trabajo ágil para gestionar el desarrollo iterativo </w:t>
+      </w:r>
+      <w:proofErr w:type="spellStart"/>
+      <w:r>
+        <w:rPr>
+          <w:rFonts w:ascii="Aptos" w:eastAsia="Aptos" w:hAnsi="Aptos" w:cs="Aptos"/>
+          <w:color w:val="000000" w:themeColor="text1"/>
+          <w:sz w:val="22"/>
+          <w:szCs w:val="22"/>
+          <w:lang w:val="es-MX"/>
+        </w:rPr>
+        <w:t>y</w:t>
+      </w:r>
+      <w:proofErr w:type="spellEnd"/>
+      <w:r>
+        <w:rPr>
+          <w:rFonts w:ascii="Aptos" w:eastAsia="Aptos" w:hAnsi="Aptos" w:cs="Aptos"/>
+          <w:color w:val="000000" w:themeColor="text1"/>
+          <w:sz w:val="22"/>
+          <w:szCs w:val="22"/>
+          <w:lang w:val="es-MX"/>
+        </w:rPr>
+        <w:t xml:space="preserve"> incremental, con </w:t>
       </w:r>
       <w:r>
         <w:rPr>
@@ -3740,7 +3877,51 @@
           <w:szCs w:val="22"/>
           <w:lang w:val="es-MX"/>
         </w:rPr>
-        <w:t> Aquí se alojarán todas las funcionalidades, historias de usuario y tareas identificadas para el proyecto. Es la "lista de deseos" priorizada por el Product Owner (en este caso, probablemente el cliente o el jefe de proyecto).</w:t>
+        <w:t xml:space="preserve"> Aquí se alojarán todas las funcionalidades, historias de usuario y tareas identificadas para el proyecto. Es la "lista de deseos" priorizada por el </w:t>
+      </w:r>
+      <w:proofErr w:type="spellStart"/>
+      <w:r>
+        <w:rPr>
+          <w:rFonts w:ascii="Aptos" w:eastAsia="Aptos" w:hAnsi="Aptos" w:cs="Aptos"/>
+          <w:color w:val="000000" w:themeColor="text1"/>
+          <w:sz w:val="22"/>
+          <w:szCs w:val="22"/>
+          <w:lang w:val="es-MX"/>
+        </w:rPr>
+        <w:t>Product</w:t>
+      </w:r>
+      <w:proofErr w:type="spellEnd"/>
+      <w:r>
+        <w:rPr>
+          <w:rFonts w:ascii="Aptos" w:eastAsia="Aptos" w:hAnsi="Aptos" w:cs="Aptos"/>
+          <w:color w:val="000000" w:themeColor="text1"/>
+          <w:sz w:val="22"/>
+          <w:szCs w:val="22"/>
+          <w:lang w:val="es-MX"/>
+        </w:rPr>
+        <w:t xml:space="preserve"> </w:t>
+      </w:r>
+      <w:proofErr w:type="spellStart"/>
+      <w:r>
+        <w:rPr>
+          <w:rFonts w:ascii="Aptos" w:eastAsia="Aptos" w:hAnsi="Aptos" w:cs="Aptos"/>
+          <w:color w:val="000000" w:themeColor="text1"/>
+          <w:sz w:val="22"/>
+          <w:szCs w:val="22"/>
+          <w:lang w:val="es-MX"/>
+        </w:rPr>
+        <w:t>Owner</w:t>
+      </w:r>
+      <w:proofErr w:type="spellEnd"/>
+      <w:r>
+        <w:rPr>
+          <w:rFonts w:ascii="Aptos" w:eastAsia="Aptos" w:hAnsi="Aptos" w:cs="Aptos"/>
+          <w:color w:val="000000" w:themeColor="text1"/>
+          <w:sz w:val="22"/>
+          <w:szCs w:val="22"/>
+          <w:lang w:val="es-MX"/>
+        </w:rPr>
+        <w:t xml:space="preserve"> (en este caso, probablemente el cliente o el jefe de proyecto).</w:t>
       </w:r>
     </w:p>
     <w:p>
@@ -3768,7 +3949,33 @@
           <w:szCs w:val="22"/>
           <w:lang w:val="es-MX"/>
         </w:rPr>
-        <w:t>Por Hacer (To Do):</w:t>
+        <w:t>Por Hacer (</w:t>
+      </w:r>
+      <w:proofErr w:type="spellStart"/>
+      <w:r>
+        <w:rPr>
+          <w:rFonts w:ascii="Aptos" w:eastAsia="Aptos" w:hAnsi="Aptos" w:cs="Aptos"/>
+          <w:b/>
+          <w:bCs/>
+          <w:color w:val="000000" w:themeColor="text1"/>
+          <w:sz w:val="22"/>
+          <w:szCs w:val="22"/>
+          <w:lang w:val="es-MX"/>
+        </w:rPr>
+        <w:t>To</w:t>
+      </w:r>
+      <w:proofErr w:type="spellEnd"/>
+      <w:r>
+        <w:rPr>
+          <w:rFonts w:ascii="Aptos" w:eastAsia="Aptos" w:hAnsi="Aptos" w:cs="Aptos"/>
+          <w:b/>
+          <w:bCs/>
+          <w:color w:val="000000" w:themeColor="text1"/>
+          <w:sz w:val="22"/>
+          <w:szCs w:val="22"/>
+          <w:lang w:val="es-MX"/>
+        </w:rPr>
+        <w:t xml:space="preserve"> Do):</w:t>
       </w:r>
       <w:r>
         <w:rPr>
@@ -3806,7 +4013,33 @@
           <w:szCs w:val="22"/>
           <w:lang w:val="es-MX"/>
         </w:rPr>
-        <w:t>En Progreso (Doing):</w:t>
+        <w:t>En Progreso (</w:t>
+      </w:r>
+      <w:proofErr w:type="spellStart"/>
+      <w:r>
+        <w:rPr>
+          <w:rFonts w:ascii="Aptos" w:eastAsia="Aptos" w:hAnsi="Aptos" w:cs="Aptos"/>
+          <w:b/>
+          <w:bCs/>
+          <w:color w:val="000000" w:themeColor="text1"/>
+          <w:sz w:val="22"/>
+          <w:szCs w:val="22"/>
+          <w:lang w:val="es-MX"/>
+        </w:rPr>
+        <w:t>Doing</w:t>
+      </w:r>
+      <w:proofErr w:type="spellEnd"/>
+      <w:r>
+        <w:rPr>
+          <w:rFonts w:ascii="Aptos" w:eastAsia="Aptos" w:hAnsi="Aptos" w:cs="Aptos"/>
+          <w:b/>
+          <w:bCs/>
+          <w:color w:val="000000" w:themeColor="text1"/>
+          <w:sz w:val="22"/>
+          <w:szCs w:val="22"/>
+          <w:lang w:val="es-MX"/>
+        </w:rPr>
+        <w:t>):</w:t>
       </w:r>
       <w:r>
         <w:rPr>
@@ -4120,13 +4353,31 @@
                 <w:szCs w:val="22"/>
               </w:rPr>
             </w:pPr>
+            <w:proofErr w:type="spellStart"/>
             <w:r>
               <w:rPr>
                 <w:sz w:val="22"/>
                 <w:szCs w:val="22"/>
               </w:rPr>
-              <w:t>Gestión de clientes</w:t>
+              <w:t>Gestión</w:t>
             </w:r>
+            <w:proofErr w:type="spellEnd"/>
+            <w:r>
+              <w:rPr>
+                <w:sz w:val="22"/>
+                <w:szCs w:val="22"/>
+              </w:rPr>
+              <w:t xml:space="preserve"> de </w:t>
+            </w:r>
+            <w:proofErr w:type="spellStart"/>
+            <w:r>
+              <w:rPr>
+                <w:sz w:val="22"/>
+                <w:szCs w:val="22"/>
+              </w:rPr>
+              <w:t>clientes</w:t>
+            </w:r>
+            <w:proofErr w:type="spellEnd"/>
           </w:p>
         </w:tc>
         <w:tc>
@@ -4194,13 +4445,31 @@
                 <w:szCs w:val="22"/>
               </w:rPr>
             </w:pPr>
+            <w:proofErr w:type="spellStart"/>
             <w:r>
               <w:rPr>
                 <w:sz w:val="22"/>
                 <w:szCs w:val="22"/>
               </w:rPr>
-              <w:t>Agendamiento de citas</w:t>
+              <w:t>Agendamiento</w:t>
             </w:r>
+            <w:proofErr w:type="spellEnd"/>
+            <w:r>
+              <w:rPr>
+                <w:sz w:val="22"/>
+                <w:szCs w:val="22"/>
+              </w:rPr>
+              <w:t xml:space="preserve"> de </w:t>
+            </w:r>
+            <w:proofErr w:type="spellStart"/>
+            <w:r>
+              <w:rPr>
+                <w:sz w:val="22"/>
+                <w:szCs w:val="22"/>
+              </w:rPr>
+              <w:t>citas</w:t>
+            </w:r>
+            <w:proofErr w:type="spellEnd"/>
           </w:p>
         </w:tc>
         <w:tc>
@@ -4268,13 +4537,31 @@
                 <w:szCs w:val="22"/>
               </w:rPr>
             </w:pPr>
+            <w:proofErr w:type="spellStart"/>
             <w:r>
               <w:rPr>
                 <w:sz w:val="22"/>
                 <w:szCs w:val="22"/>
               </w:rPr>
-              <w:t>Registro de servicios</w:t>
+              <w:t>Registro</w:t>
             </w:r>
+            <w:proofErr w:type="spellEnd"/>
+            <w:r>
+              <w:rPr>
+                <w:sz w:val="22"/>
+                <w:szCs w:val="22"/>
+              </w:rPr>
+              <w:t xml:space="preserve"> de </w:t>
+            </w:r>
+            <w:proofErr w:type="spellStart"/>
+            <w:r>
+              <w:rPr>
+                <w:sz w:val="22"/>
+                <w:szCs w:val="22"/>
+              </w:rPr>
+              <w:t>servicios</w:t>
+            </w:r>
+            <w:proofErr w:type="spellEnd"/>
           </w:p>
         </w:tc>
         <w:tc>
@@ -4397,8 +4684,17 @@
                 <w:sz w:val="22"/>
                 <w:szCs w:val="22"/>
               </w:rPr>
-              <w:t>Control de inventario</w:t>
+              <w:t xml:space="preserve">Control de </w:t>
             </w:r>
+            <w:proofErr w:type="spellStart"/>
+            <w:r>
+              <w:rPr>
+                <w:sz w:val="22"/>
+                <w:szCs w:val="22"/>
+              </w:rPr>
+              <w:t>inventario</w:t>
+            </w:r>
+            <w:proofErr w:type="spellEnd"/>
           </w:p>
         </w:tc>
         <w:tc>
@@ -4466,6 +4762,7 @@
                 <w:szCs w:val="22"/>
               </w:rPr>
             </w:pPr>
+            <w:proofErr w:type="spellStart"/>
             <w:r>
               <w:rPr>
                 <w:sz w:val="22"/>
@@ -4473,6 +4770,7 @@
               </w:rPr>
               <w:t>Facturación</w:t>
             </w:r>
+            <w:proofErr w:type="spellEnd"/>
           </w:p>
         </w:tc>
         <w:tc>
@@ -4541,13 +4839,31 @@
                 <w:szCs w:val="22"/>
               </w:rPr>
             </w:pPr>
+            <w:proofErr w:type="spellStart"/>
             <w:r>
               <w:rPr>
                 <w:sz w:val="22"/>
                 <w:szCs w:val="22"/>
               </w:rPr>
-              <w:t>Historial de vehículos</w:t>
+              <w:t>Historial</w:t>
             </w:r>
+            <w:proofErr w:type="spellEnd"/>
+            <w:r>
+              <w:rPr>
+                <w:sz w:val="22"/>
+                <w:szCs w:val="22"/>
+              </w:rPr>
+              <w:t xml:space="preserve"> de </w:t>
+            </w:r>
+            <w:proofErr w:type="spellStart"/>
+            <w:r>
+              <w:rPr>
+                <w:sz w:val="22"/>
+                <w:szCs w:val="22"/>
+              </w:rPr>
+              <w:t>vehículos</w:t>
+            </w:r>
+            <w:proofErr w:type="spellEnd"/>
           </w:p>
         </w:tc>
         <w:tc>
@@ -4670,8 +4986,17 @@
                 <w:sz w:val="22"/>
                 <w:szCs w:val="22"/>
               </w:rPr>
-              <w:t>Dashboard gerencial</w:t>
+              <w:t xml:space="preserve">Dashboard </w:t>
             </w:r>
+            <w:proofErr w:type="spellStart"/>
+            <w:r>
+              <w:rPr>
+                <w:sz w:val="22"/>
+                <w:szCs w:val="22"/>
+              </w:rPr>
+              <w:t>gerencial</w:t>
+            </w:r>
+            <w:proofErr w:type="spellEnd"/>
           </w:p>
         </w:tc>
         <w:tc>
@@ -4816,6 +5141,7 @@
                 <w:szCs w:val="22"/>
               </w:rPr>
             </w:pPr>
+            <w:proofErr w:type="spellStart"/>
             <w:r>
               <w:rPr>
                 <w:sz w:val="22"/>
@@ -4823,6 +5149,7 @@
               </w:rPr>
               <w:t>Notificaciones</w:t>
             </w:r>
+            <w:proofErr w:type="spellEnd"/>
           </w:p>
         </w:tc>
         <w:tc>
@@ -4890,12 +5217,53 @@
                 <w:szCs w:val="22"/>
               </w:rPr>
             </w:pPr>
+            <w:proofErr w:type="spellStart"/>
             <w:r>
               <w:rPr>
                 <w:sz w:val="22"/>
                 <w:szCs w:val="22"/>
               </w:rPr>
-              <w:t>Notificaciones externas (Clientes)</w:t>
+              <w:t>Notificaciones</w:t>
+            </w:r>
+            <w:proofErr w:type="spellEnd"/>
+            <w:r>
+              <w:rPr>
+                <w:sz w:val="22"/>
+                <w:szCs w:val="22"/>
+              </w:rPr>
+              <w:t xml:space="preserve"> </w:t>
+            </w:r>
+            <w:proofErr w:type="spellStart"/>
+            <w:r>
+              <w:rPr>
+                <w:sz w:val="22"/>
+                <w:szCs w:val="22"/>
+              </w:rPr>
+              <w:t>externas</w:t>
+            </w:r>
+            <w:proofErr w:type="spellEnd"/>
+            <w:r>
+              <w:rPr>
+                <w:sz w:val="22"/>
+                <w:szCs w:val="22"/>
+              </w:rPr>
+              <w:t xml:space="preserve"> (</w:t>
+            </w:r>
+            <w:proofErr w:type="spellStart"/>
+            <w:r>
+              <w:rPr>
+                <w:sz w:val="22"/>
+                <w:szCs w:val="22"/>
+              </w:rPr>
+              <w:t>Clientes</w:t>
+            </w:r>
+            <w:proofErr w:type="spellEnd"/>
+            <w:r>
+              <w:rPr>
+                <w:sz w:val="22"/>
+                <w:szCs w:val="22"/>
+              </w:rPr>
+              <w:t>)</w:t>
             </w:r>
           </w:p>
         </w:tc>
@@ -4964,12 +5332,37 @@
                 <w:szCs w:val="22"/>
               </w:rPr>
             </w:pPr>
+            <w:proofErr w:type="spellStart"/>
             <w:r>
               <w:rPr>
                 <w:sz w:val="22"/>
                 <w:szCs w:val="22"/>
               </w:rPr>
-              <w:t>Notificaciones internas (Taller)</w:t>
+              <w:t>Notificaciones</w:t>
+            </w:r>
+            <w:proofErr w:type="spellEnd"/>
+            <w:r>
+              <w:rPr>
+                <w:sz w:val="22"/>
+                <w:szCs w:val="22"/>
+              </w:rPr>
+              <w:t xml:space="preserve"> </w:t>
+            </w:r>
+            <w:proofErr w:type="spellStart"/>
+            <w:r>
+              <w:rPr>
+                <w:sz w:val="22"/>
+                <w:szCs w:val="22"/>
+              </w:rPr>
+              <w:t>internas</w:t>
+            </w:r>
+            <w:proofErr w:type="spellEnd"/>
+            <w:r>
+              <w:rPr>
+                <w:sz w:val="22"/>
+                <w:szCs w:val="22"/>
+              </w:rPr>
+              <w:t xml:space="preserve"> (Taller)</w:t>
             </w:r>
           </w:p>
         </w:tc>
@@ -5154,7 +5547,199 @@
                 <w:sz w:val="22"/>
                 <w:szCs w:val="22"/>
               </w:rPr>
-              <w:t>Registrar pagos, gestionar cuentas por cobrar/pagar, soportar múltiples métodos de pago (efectivo, tarjeta, transferencia).</w:t>
+              <w:t xml:space="preserve">Registrar pagos, </w:t>
+            </w:r>
+            <w:proofErr w:type="spellStart"/>
+            <w:r>
+              <w:rPr>
+                <w:sz w:val="22"/>
+                <w:szCs w:val="22"/>
+              </w:rPr>
+              <w:t>gestionar</w:t>
+            </w:r>
+            <w:proofErr w:type="spellEnd"/>
+            <w:r>
+              <w:rPr>
+                <w:sz w:val="22"/>
+                <w:szCs w:val="22"/>
+              </w:rPr>
+              <w:t xml:space="preserve"> </w:t>
+            </w:r>
+            <w:proofErr w:type="spellStart"/>
+            <w:r>
+              <w:rPr>
+                <w:sz w:val="22"/>
+                <w:szCs w:val="22"/>
+              </w:rPr>
+              <w:t>cuentas</w:t>
+            </w:r>
+            <w:proofErr w:type="spellEnd"/>
+            <w:r>
+              <w:rPr>
+                <w:sz w:val="22"/>
+                <w:szCs w:val="22"/>
+              </w:rPr>
+              <w:t xml:space="preserve"> </w:t>
+            </w:r>
+            <w:proofErr w:type="spellStart"/>
+            <w:r>
+              <w:rPr>
+                <w:sz w:val="22"/>
+                <w:szCs w:val="22"/>
+              </w:rPr>
+              <w:t>por</w:t>
+            </w:r>
+            <w:proofErr w:type="spellEnd"/>
+            <w:r>
+              <w:rPr>
+                <w:sz w:val="22"/>
+                <w:szCs w:val="22"/>
+              </w:rPr>
+              <w:t xml:space="preserve"> </w:t>
+            </w:r>
+            <w:proofErr w:type="spellStart"/>
+            <w:r>
+              <w:rPr>
+                <w:sz w:val="22"/>
+                <w:szCs w:val="22"/>
+              </w:rPr>
+              <w:t>cobrar</w:t>
+            </w:r>
+            <w:proofErr w:type="spellEnd"/>
+            <w:r>
+              <w:rPr>
+                <w:sz w:val="22"/>
+                <w:szCs w:val="22"/>
+              </w:rPr>
+              <w:t>/</w:t>
+            </w:r>
+            <w:proofErr w:type="spellStart"/>
+            <w:r>
+              <w:rPr>
+                <w:sz w:val="22"/>
+                <w:szCs w:val="22"/>
+              </w:rPr>
+              <w:t>pagar</w:t>
+            </w:r>
+            <w:proofErr w:type="spellEnd"/>
+            <w:r>
+              <w:rPr>
+                <w:sz w:val="22"/>
+                <w:szCs w:val="22"/>
+              </w:rPr>
+              <w:t xml:space="preserve">, </w:t>
+            </w:r>
+            <w:proofErr w:type="spellStart"/>
+            <w:r>
+              <w:rPr>
+                <w:sz w:val="22"/>
+                <w:szCs w:val="22"/>
+              </w:rPr>
+              <w:t>soportar</w:t>
+            </w:r>
+            <w:proofErr w:type="spellEnd"/>
+            <w:r>
+              <w:rPr>
+                <w:sz w:val="22"/>
+                <w:szCs w:val="22"/>
+              </w:rPr>
+              <w:t xml:space="preserve"> </w:t>
+            </w:r>
+            <w:proofErr w:type="spellStart"/>
+            <w:r>
+              <w:rPr>
+                <w:sz w:val="22"/>
+                <w:szCs w:val="22"/>
+              </w:rPr>
+              <w:t>múltiples</w:t>
+            </w:r>
+            <w:proofErr w:type="spellEnd"/>
+            <w:r>
+              <w:rPr>
+                <w:sz w:val="22"/>
+                <w:szCs w:val="22"/>
+              </w:rPr>
+              <w:t xml:space="preserve"> </w:t>
+            </w:r>
+            <w:proofErr w:type="spellStart"/>
+            <w:r>
+              <w:rPr>
+                <w:sz w:val="22"/>
+                <w:szCs w:val="22"/>
+              </w:rPr>
+              <w:t>métodos</w:t>
+            </w:r>
+            <w:proofErr w:type="spellEnd"/>
+            <w:r>
+              <w:rPr>
+                <w:sz w:val="22"/>
+                <w:szCs w:val="22"/>
+              </w:rPr>
+              <w:t xml:space="preserve"> de </w:t>
+            </w:r>
+            <w:proofErr w:type="spellStart"/>
+            <w:r>
+              <w:rPr>
+                <w:sz w:val="22"/>
+                <w:szCs w:val="22"/>
+              </w:rPr>
+              <w:t>pago</w:t>
+            </w:r>
+            <w:proofErr w:type="spellEnd"/>
+            <w:r>
+              <w:rPr>
+                <w:sz w:val="22"/>
+                <w:szCs w:val="22"/>
+              </w:rPr>
+              <w:t xml:space="preserve"> (</w:t>
+            </w:r>
+            <w:proofErr w:type="spellStart"/>
+            <w:r>
+              <w:rPr>
+                <w:sz w:val="22"/>
+                <w:szCs w:val="22"/>
+              </w:rPr>
+              <w:t>efectivo</w:t>
+            </w:r>
+            <w:proofErr w:type="spellEnd"/>
+            <w:r>
+              <w:rPr>
+                <w:sz w:val="22"/>
+                <w:szCs w:val="22"/>
+              </w:rPr>
+              <w:t xml:space="preserve">, </w:t>
+            </w:r>
+            <w:proofErr w:type="spellStart"/>
+            <w:r>
+              <w:rPr>
+                <w:sz w:val="22"/>
+                <w:szCs w:val="22"/>
+              </w:rPr>
+              <w:t>tarjeta</w:t>
+            </w:r>
+            <w:proofErr w:type="spellEnd"/>
+            <w:r>
+              <w:rPr>
+                <w:sz w:val="22"/>
+                <w:szCs w:val="22"/>
+              </w:rPr>
+              <w:t xml:space="preserve">, </w:t>
+            </w:r>
+            <w:proofErr w:type="spellStart"/>
+            <w:r>
+              <w:rPr>
+                <w:sz w:val="22"/>
+                <w:szCs w:val="22"/>
+              </w:rPr>
+              <w:t>transferencia</w:t>
+            </w:r>
+            <w:proofErr w:type="spellEnd"/>
+            <w:r>
+              <w:rPr>
+                <w:sz w:val="22"/>
+                <w:szCs w:val="22"/>
+              </w:rPr>
+              <w:t>).</w:t>
             </w:r>
           </w:p>
         </w:tc>
@@ -5223,12 +5808,117 @@
                 <w:szCs w:val="22"/>
               </w:rPr>
             </w:pPr>
+            <w:proofErr w:type="spellStart"/>
             <w:r>
               <w:rPr>
                 <w:sz w:val="22"/>
                 <w:szCs w:val="22"/>
               </w:rPr>
-              <w:t>Exportar información relevante (clientes, servicios, inventario, citas) a PDF o Excel.</w:t>
+              <w:t>Exportar</w:t>
+            </w:r>
+            <w:proofErr w:type="spellEnd"/>
+            <w:r>
+              <w:rPr>
+                <w:sz w:val="22"/>
+                <w:szCs w:val="22"/>
+              </w:rPr>
+              <w:t xml:space="preserve"> </w:t>
+            </w:r>
+            <w:proofErr w:type="spellStart"/>
+            <w:r>
+              <w:rPr>
+                <w:sz w:val="22"/>
+                <w:szCs w:val="22"/>
+              </w:rPr>
+              <w:t>información</w:t>
+            </w:r>
+            <w:proofErr w:type="spellEnd"/>
+            <w:r>
+              <w:rPr>
+                <w:sz w:val="22"/>
+                <w:szCs w:val="22"/>
+              </w:rPr>
+              <w:t xml:space="preserve"> </w:t>
+            </w:r>
+            <w:proofErr w:type="spellStart"/>
+            <w:r>
+              <w:rPr>
+                <w:sz w:val="22"/>
+                <w:szCs w:val="22"/>
+              </w:rPr>
+              <w:t>relevante</w:t>
+            </w:r>
+            <w:proofErr w:type="spellEnd"/>
+            <w:r>
+              <w:rPr>
+                <w:sz w:val="22"/>
+                <w:szCs w:val="22"/>
+              </w:rPr>
+              <w:t xml:space="preserve"> (</w:t>
+            </w:r>
+            <w:proofErr w:type="spellStart"/>
+            <w:r>
+              <w:rPr>
+                <w:sz w:val="22"/>
+                <w:szCs w:val="22"/>
+              </w:rPr>
+              <w:t>clientes</w:t>
+            </w:r>
+            <w:proofErr w:type="spellEnd"/>
+            <w:r>
+              <w:rPr>
+                <w:sz w:val="22"/>
+                <w:szCs w:val="22"/>
+              </w:rPr>
+              <w:t xml:space="preserve">, </w:t>
+            </w:r>
+            <w:proofErr w:type="spellStart"/>
+            <w:r>
+              <w:rPr>
+                <w:sz w:val="22"/>
+                <w:szCs w:val="22"/>
+              </w:rPr>
+              <w:t>servicios</w:t>
+            </w:r>
+            <w:proofErr w:type="spellEnd"/>
+            <w:r>
+              <w:rPr>
+                <w:sz w:val="22"/>
+                <w:szCs w:val="22"/>
+              </w:rPr>
+              <w:t xml:space="preserve">, </w:t>
+            </w:r>
+            <w:proofErr w:type="spellStart"/>
+            <w:r>
+              <w:rPr>
+                <w:sz w:val="22"/>
+                <w:szCs w:val="22"/>
+              </w:rPr>
+              <w:t>inventario</w:t>
+            </w:r>
+            <w:proofErr w:type="spellEnd"/>
+            <w:r>
+              <w:rPr>
+                <w:sz w:val="22"/>
+                <w:szCs w:val="22"/>
+              </w:rPr>
+              <w:t xml:space="preserve">, </w:t>
+            </w:r>
+            <w:proofErr w:type="spellStart"/>
+            <w:r>
+              <w:rPr>
+                <w:sz w:val="22"/>
+                <w:szCs w:val="22"/>
+              </w:rPr>
+              <w:t>citas</w:t>
+            </w:r>
+            <w:proofErr w:type="spellEnd"/>
+            <w:r>
+              <w:rPr>
+                <w:sz w:val="22"/>
+                <w:szCs w:val="22"/>
+              </w:rPr>
+              <w:t>) a PDF o Excel.</w:t>
             </w:r>
           </w:p>
         </w:tc>
@@ -5259,7 +5949,27 @@
           <w:sz w:val="22"/>
           <w:szCs w:val="22"/>
         </w:rPr>
-        <w:t>Requisitos No funcionales:</w:t>
+        <w:t xml:space="preserve">Requisitos No </w:t>
+      </w:r>
+      <w:proofErr w:type="spellStart"/>
+      <w:r>
+        <w:rPr>
+          <w:b/>
+          <w:bCs/>
+          <w:sz w:val="22"/>
+          <w:szCs w:val="22"/>
+        </w:rPr>
+        <w:t>funcionales</w:t>
+      </w:r>
+      <w:proofErr w:type="spellEnd"/>
+      <w:r>
+        <w:rPr>
+          <w:b/>
+          <w:bCs/>
+          <w:sz w:val="22"/>
+          <w:szCs w:val="22"/>
+        </w:rPr>
+        <w:t>:</w:t>
       </w:r>
     </w:p>
     <w:tbl>
@@ -5390,6 +6100,7 @@
                 <w:szCs w:val="22"/>
               </w:rPr>
             </w:pPr>
+            <w:proofErr w:type="spellStart"/>
             <w:r>
               <w:rPr>
                 <w:sz w:val="22"/>
@@ -5397,6 +6108,7 @@
               </w:rPr>
               <w:t>Usabilidad</w:t>
             </w:r>
+            <w:proofErr w:type="spellEnd"/>
           </w:p>
         </w:tc>
         <w:tc>
@@ -5461,6 +6173,7 @@
                 <w:szCs w:val="22"/>
               </w:rPr>
             </w:pPr>
+            <w:proofErr w:type="spellStart"/>
             <w:r>
               <w:rPr>
                 <w:sz w:val="22"/>
@@ -5468,6 +6181,7 @@
               </w:rPr>
               <w:t>Rendimiento</w:t>
             </w:r>
+            <w:proofErr w:type="spellEnd"/>
           </w:p>
         </w:tc>
         <w:tc>
@@ -5532,6 +6246,7 @@
                 <w:szCs w:val="22"/>
               </w:rPr>
             </w:pPr>
+            <w:proofErr w:type="spellStart"/>
             <w:r>
               <w:rPr>
                 <w:sz w:val="22"/>
@@ -5539,6 +6254,7 @@
               </w:rPr>
               <w:t>Seguridad</w:t>
             </w:r>
+            <w:proofErr w:type="spellEnd"/>
           </w:p>
         </w:tc>
         <w:tc>
@@ -5763,6 +6479,7 @@
                 <w:szCs w:val="22"/>
               </w:rPr>
             </w:pPr>
+            <w:proofErr w:type="spellStart"/>
             <w:r>
               <w:rPr>
                 <w:sz w:val="22"/>
@@ -5770,6 +6487,7 @@
               </w:rPr>
               <w:t>Disponibilidad</w:t>
             </w:r>
+            <w:proofErr w:type="spellEnd"/>
           </w:p>
         </w:tc>
         <w:tc>
@@ -5834,6 +6552,7 @@
                 <w:szCs w:val="22"/>
               </w:rPr>
             </w:pPr>
+            <w:proofErr w:type="spellStart"/>
             <w:r>
               <w:rPr>
                 <w:sz w:val="22"/>
@@ -5841,6 +6560,7 @@
               </w:rPr>
               <w:t>Compatibilidad</w:t>
             </w:r>
+            <w:proofErr w:type="spellEnd"/>
           </w:p>
         </w:tc>
         <w:tc>
@@ -5854,12 +6574,117 @@
                 <w:szCs w:val="22"/>
               </w:rPr>
             </w:pPr>
+            <w:proofErr w:type="spellStart"/>
             <w:r>
               <w:rPr>
                 <w:sz w:val="22"/>
                 <w:szCs w:val="22"/>
               </w:rPr>
-              <w:t>Funcionamiento garantizado en navegadores modernos (Chrome, Edge, Firefox); soporte multiplataforma (Windows, Linux, MacOS).</w:t>
+              <w:t>Funcionamiento</w:t>
+            </w:r>
+            <w:proofErr w:type="spellEnd"/>
+            <w:r>
+              <w:rPr>
+                <w:sz w:val="22"/>
+                <w:szCs w:val="22"/>
+              </w:rPr>
+              <w:t xml:space="preserve"> </w:t>
+            </w:r>
+            <w:proofErr w:type="spellStart"/>
+            <w:r>
+              <w:rPr>
+                <w:sz w:val="22"/>
+                <w:szCs w:val="22"/>
+              </w:rPr>
+              <w:t>garantizado</w:t>
+            </w:r>
+            <w:proofErr w:type="spellEnd"/>
+            <w:r>
+              <w:rPr>
+                <w:sz w:val="22"/>
+                <w:szCs w:val="22"/>
+              </w:rPr>
+              <w:t xml:space="preserve"> </w:t>
+            </w:r>
+            <w:proofErr w:type="spellStart"/>
+            <w:r>
+              <w:rPr>
+                <w:sz w:val="22"/>
+                <w:szCs w:val="22"/>
+              </w:rPr>
+              <w:t>en</w:t>
+            </w:r>
+            <w:proofErr w:type="spellEnd"/>
+            <w:r>
+              <w:rPr>
+                <w:sz w:val="22"/>
+                <w:szCs w:val="22"/>
+              </w:rPr>
+              <w:t xml:space="preserve"> </w:t>
+            </w:r>
+            <w:proofErr w:type="spellStart"/>
+            <w:r>
+              <w:rPr>
+                <w:sz w:val="22"/>
+                <w:szCs w:val="22"/>
+              </w:rPr>
+              <w:t>navegadores</w:t>
+            </w:r>
+            <w:proofErr w:type="spellEnd"/>
+            <w:r>
+              <w:rPr>
+                <w:sz w:val="22"/>
+                <w:szCs w:val="22"/>
+              </w:rPr>
+              <w:t xml:space="preserve"> </w:t>
+            </w:r>
+            <w:proofErr w:type="spellStart"/>
+            <w:r>
+              <w:rPr>
+                <w:sz w:val="22"/>
+                <w:szCs w:val="22"/>
+              </w:rPr>
+              <w:t>modernos</w:t>
+            </w:r>
+            <w:proofErr w:type="spellEnd"/>
+            <w:r>
+              <w:rPr>
+                <w:sz w:val="22"/>
+                <w:szCs w:val="22"/>
+              </w:rPr>
+              <w:t xml:space="preserve"> (Chrome, Edge, Firefox); </w:t>
+            </w:r>
+            <w:proofErr w:type="spellStart"/>
+            <w:r>
+              <w:rPr>
+                <w:sz w:val="22"/>
+                <w:szCs w:val="22"/>
+              </w:rPr>
+              <w:t>soporte</w:t>
+            </w:r>
+            <w:proofErr w:type="spellEnd"/>
+            <w:r>
+              <w:rPr>
+                <w:sz w:val="22"/>
+                <w:szCs w:val="22"/>
+              </w:rPr>
+              <w:t xml:space="preserve"> </w:t>
+            </w:r>
+            <w:proofErr w:type="spellStart"/>
+            <w:r>
+              <w:rPr>
+                <w:sz w:val="22"/>
+                <w:szCs w:val="22"/>
+              </w:rPr>
+              <w:t>multiplataforma</w:t>
+            </w:r>
+            <w:proofErr w:type="spellEnd"/>
+            <w:r>
+              <w:rPr>
+                <w:sz w:val="22"/>
+                <w:szCs w:val="22"/>
+              </w:rPr>
+              <w:t xml:space="preserve"> (Windows, Linux, MacOS).</w:t>
             </w:r>
           </w:p>
         </w:tc>
@@ -5903,6 +6728,7 @@
                 <w:szCs w:val="22"/>
               </w:rPr>
             </w:pPr>
+            <w:proofErr w:type="spellStart"/>
             <w:r>
               <w:rPr>
                 <w:sz w:val="22"/>
@@ -5910,6 +6736,7 @@
               </w:rPr>
               <w:t>Mantenibilidad</w:t>
             </w:r>
+            <w:proofErr w:type="spellEnd"/>
           </w:p>
         </w:tc>
         <w:tc>
@@ -6062,12 +6889,21 @@
                 <w:szCs w:val="22"/>
               </w:rPr>
             </w:pPr>
+            <w:proofErr w:type="spellStart"/>
             <w:r>
               <w:rPr>
                 <w:sz w:val="22"/>
                 <w:szCs w:val="22"/>
               </w:rPr>
-              <w:t>Portabilidad / Responsividad</w:t>
+              <w:t>Portabilidad</w:t>
+            </w:r>
+            <w:proofErr w:type="spellEnd"/>
+            <w:r>
+              <w:rPr>
+                <w:sz w:val="22"/>
+                <w:szCs w:val="22"/>
+              </w:rPr>
+              <w:t xml:space="preserve"> / Responsividad</w:t>
             </w:r>
           </w:p>
         </w:tc>
@@ -6319,7 +7155,7 @@
           <w:lang w:val="es-CO"/>
         </w:rPr>
         <w:drawing>
-          <wp:inline distT="0" distB="0" distL="0" distR="0" wp14:anchorId="3E67F712" wp14:editId="406C46B6">
+          <wp:inline distT="0" distB="0" distL="0" distR="0" wp14:anchorId="3E67F712" wp14:editId="5BD75DE3">
             <wp:extent cx="6858000" cy="4653280"/>
             <wp:effectExtent l="0" t="0" r="0" b="0"/>
             <wp:docPr id="2048164561" name="Imagen 2" descr="Diagrama, Esquemático&#10;&#10;El contenido generado por IA puede ser incorrecto."/>
@@ -6546,8 +7382,16 @@
           <w:lang w:val="es-CO"/>
         </w:rPr>
         <w:lastRenderedPageBreak/>
-        <w:t>Dashboard Secretaria</w:t>
-      </w:r>
+        <w:t xml:space="preserve">Dashboard </w:t>
+      </w:r>
+      <w:proofErr w:type="gramStart"/>
+      <w:r>
+        <w:rPr>
+          <w:lang w:val="es-CO"/>
+        </w:rPr>
+        <w:t>Secretaria</w:t>
+      </w:r>
+      <w:proofErr w:type="gramEnd"/>
     </w:p>
     <w:p>
       <w:pPr>
@@ -7014,7 +7858,25 @@
           <w:szCs w:val="22"/>
           <w:lang w:val="es-CO"/>
         </w:rPr>
-        <w:t>, donde se priorizaron conjuntamente con el cliente.</w:t>
+        <w:t xml:space="preserve">, donde se priorizaron </w:t>
+      </w:r>
+      <w:proofErr w:type="gramStart"/>
+      <w:r>
+        <w:rPr>
+          <w:sz w:val="22"/>
+          <w:szCs w:val="22"/>
+          <w:lang w:val="es-CO"/>
+        </w:rPr>
+        <w:t>conjuntamente con</w:t>
+      </w:r>
+      <w:proofErr w:type="gramEnd"/>
+      <w:r>
+        <w:rPr>
+          <w:sz w:val="22"/>
+          <w:szCs w:val="22"/>
+          <w:lang w:val="es-CO"/>
+        </w:rPr>
+        <w:t xml:space="preserve"> el cliente.</w:t>
       </w:r>
     </w:p>
     <w:p>
@@ -7183,7 +8045,25 @@
           <w:szCs w:val="22"/>
           <w:lang w:val="es-CO"/>
         </w:rPr>
-        <w:t> Se optó por una arquitectura cliente-servidor (frontend/backend) con una API REST.</w:t>
+        <w:t> Se optó por una arquitectura cliente-servidor (</w:t>
+      </w:r>
+      <w:proofErr w:type="spellStart"/>
+      <w:r>
+        <w:rPr>
+          <w:sz w:val="22"/>
+          <w:szCs w:val="22"/>
+          <w:lang w:val="es-CO"/>
+        </w:rPr>
+        <w:t>frontend</w:t>
+      </w:r>
+      <w:proofErr w:type="spellEnd"/>
+      <w:r>
+        <w:rPr>
+          <w:sz w:val="22"/>
+          <w:szCs w:val="22"/>
+          <w:lang w:val="es-CO"/>
+        </w:rPr>
+        <w:t>/backend) con una API REST.</w:t>
       </w:r>
     </w:p>
     <w:p>
@@ -7214,7 +8094,25 @@
           <w:szCs w:val="22"/>
           <w:lang w:val="es-CO"/>
         </w:rPr>
-        <w:t> Se modeló el diagrama entidad-relación (ER) definiendo las tablas: Clientes, Vehículos, Órdenes_de_Servicio, Repuestos, etc.</w:t>
+        <w:t> Se modeló el diagrama entidad-relación (ER) definiendo las tablas: Clientes, Vehículos, </w:t>
+      </w:r>
+      <w:proofErr w:type="spellStart"/>
+      <w:r>
+        <w:rPr>
+          <w:sz w:val="22"/>
+          <w:szCs w:val="22"/>
+          <w:lang w:val="es-CO"/>
+        </w:rPr>
+        <w:t>Órdenes_de_Servicio</w:t>
+      </w:r>
+      <w:proofErr w:type="spellEnd"/>
+      <w:r>
+        <w:rPr>
+          <w:sz w:val="22"/>
+          <w:szCs w:val="22"/>
+          <w:lang w:val="es-CO"/>
+        </w:rPr>
+        <w:t>, Repuestos, etc.</w:t>
       </w:r>
     </w:p>
     <w:p>
@@ -7245,7 +8143,25 @@
           <w:szCs w:val="22"/>
           <w:lang w:val="es-CO"/>
         </w:rPr>
-        <w:t> Se crearon wireframes y prototipos para todas las pantallas, enfocándonos en la usabilidad para el entorno de un taller.</w:t>
+        <w:t xml:space="preserve"> Se crearon </w:t>
+      </w:r>
+      <w:proofErr w:type="spellStart"/>
+      <w:r>
+        <w:rPr>
+          <w:sz w:val="22"/>
+          <w:szCs w:val="22"/>
+          <w:lang w:val="es-CO"/>
+        </w:rPr>
+        <w:t>wireframes</w:t>
+      </w:r>
+      <w:proofErr w:type="spellEnd"/>
+      <w:r>
+        <w:rPr>
+          <w:sz w:val="22"/>
+          <w:szCs w:val="22"/>
+          <w:lang w:val="es-CO"/>
+        </w:rPr>
+        <w:t xml:space="preserve"> y prototipos para todas las pantallas, enfocándonos en la usabilidad para el entorno de un taller.</w:t>
       </w:r>
     </w:p>
     <w:p>
@@ -7383,7 +8299,25 @@
           <w:lang w:val="es-CO"/>
         </w:rPr>
         <w:br/>
-        <w:t>El desarrollo se organizó en Sprints de 2 semanas usando el tablero de Trello. Las tarjetas del backlog se convertían en tareas de desarrollo en las listas "Por Hacer", "En Progreso", "Revisión" y "Hecho".</w:t>
+        <w:t>El desarrollo se organizó en </w:t>
+      </w:r>
+      <w:proofErr w:type="spellStart"/>
+      <w:r>
+        <w:rPr>
+          <w:sz w:val="22"/>
+          <w:szCs w:val="22"/>
+          <w:lang w:val="es-CO"/>
+        </w:rPr>
+        <w:t>Sprints</w:t>
+      </w:r>
+      <w:proofErr w:type="spellEnd"/>
+      <w:r>
+        <w:rPr>
+          <w:sz w:val="22"/>
+          <w:szCs w:val="22"/>
+          <w:lang w:val="es-CO"/>
+        </w:rPr>
+        <w:t xml:space="preserve"> de 2 semanas usando el tablero de Trello. Las tarjetas del backlog se convertían en tareas de desarrollo en las listas "Por Hacer", "En Progreso", "Revisión" y "Hecho".</w:t>
       </w:r>
     </w:p>
     <w:p>
@@ -7414,7 +8348,25 @@
           <w:szCs w:val="22"/>
           <w:lang w:val="es-CO"/>
         </w:rPr>
-        <w:t> El frontend se desarrolló con React.js para una interfaz dinámica, el backend con </w:t>
+        <w:t xml:space="preserve"> El </w:t>
+      </w:r>
+      <w:proofErr w:type="spellStart"/>
+      <w:r>
+        <w:rPr>
+          <w:sz w:val="22"/>
+          <w:szCs w:val="22"/>
+          <w:lang w:val="es-CO"/>
+        </w:rPr>
+        <w:t>frontend</w:t>
+      </w:r>
+      <w:proofErr w:type="spellEnd"/>
+      <w:r>
+        <w:rPr>
+          <w:sz w:val="22"/>
+          <w:szCs w:val="22"/>
+          <w:lang w:val="es-CO"/>
+        </w:rPr>
+        <w:t xml:space="preserve"> se desarrolló con React.js para una interfaz dinámica, el backend con </w:t>
       </w:r>
       <w:r>
         <w:rPr>
@@ -8116,7 +9068,25 @@
           <w:szCs w:val="22"/>
           <w:lang w:val="es-CO"/>
         </w:rPr>
-        <w:t> Utilización de .NET 9, React 19 y PostgreSQL con Supabase, asegurando alto rendimiento y mantenibilidad.</w:t>
+        <w:t xml:space="preserve"> Utilización de .NET 9, React 19 y PostgreSQL con </w:t>
+      </w:r>
+      <w:proofErr w:type="spellStart"/>
+      <w:r>
+        <w:rPr>
+          <w:sz w:val="22"/>
+          <w:szCs w:val="22"/>
+          <w:lang w:val="es-CO"/>
+        </w:rPr>
+        <w:t>Supabase</w:t>
+      </w:r>
+      <w:proofErr w:type="spellEnd"/>
+      <w:r>
+        <w:rPr>
+          <w:sz w:val="22"/>
+          <w:szCs w:val="22"/>
+          <w:lang w:val="es-CO"/>
+        </w:rPr>
+        <w:t>, asegurando alto rendimiento y mantenibilidad.</w:t>
       </w:r>
     </w:p>
     <w:p>
@@ -8147,7 +9117,25 @@
           <w:szCs w:val="22"/>
           <w:lang w:val="es-CO"/>
         </w:rPr>
-        <w:t> Implementación completa con Swagger para una integración sencilla y transparente.</w:t>
+        <w:t xml:space="preserve"> Implementación completa con </w:t>
+      </w:r>
+      <w:proofErr w:type="spellStart"/>
+      <w:r>
+        <w:rPr>
+          <w:sz w:val="22"/>
+          <w:szCs w:val="22"/>
+          <w:lang w:val="es-CO"/>
+        </w:rPr>
+        <w:t>Swagger</w:t>
+      </w:r>
+      <w:proofErr w:type="spellEnd"/>
+      <w:r>
+        <w:rPr>
+          <w:sz w:val="22"/>
+          <w:szCs w:val="22"/>
+          <w:lang w:val="es-CO"/>
+        </w:rPr>
+        <w:t xml:space="preserve"> para una integración sencilla y transparente.</w:t>
       </w:r>
     </w:p>
     <w:p>
@@ -8209,7 +9197,25 @@
           <w:szCs w:val="22"/>
           <w:lang w:val="es-CO"/>
         </w:rPr>
-        <w:t> Incluyendo gestión de inventario, facturación, y un dashboard administrativo con reportes en tiempo real.</w:t>
+        <w:t xml:space="preserve"> Incluyendo gestión de inventario, facturación, y un </w:t>
+      </w:r>
+      <w:proofErr w:type="spellStart"/>
+      <w:r>
+        <w:rPr>
+          <w:sz w:val="22"/>
+          <w:szCs w:val="22"/>
+          <w:lang w:val="es-CO"/>
+        </w:rPr>
+        <w:t>dashboard</w:t>
+      </w:r>
+      <w:proofErr w:type="spellEnd"/>
+      <w:r>
+        <w:rPr>
+          <w:sz w:val="22"/>
+          <w:szCs w:val="22"/>
+          <w:lang w:val="es-CO"/>
+        </w:rPr>
+        <w:t xml:space="preserve"> administrativo con reportes en tiempo real.</w:t>
       </w:r>
     </w:p>
     <w:p>
@@ -8259,7 +9265,43 @@
           <w:szCs w:val="22"/>
           <w:lang w:val="es-CO"/>
         </w:rPr>
-        <w:t> Dominio de .NET 9, Entity Framework Core, y el patrón Repository.</w:t>
+        <w:t xml:space="preserve"> Dominio de .NET 9, </w:t>
+      </w:r>
+      <w:proofErr w:type="spellStart"/>
+      <w:r>
+        <w:rPr>
+          <w:sz w:val="22"/>
+          <w:szCs w:val="22"/>
+          <w:lang w:val="es-CO"/>
+        </w:rPr>
+        <w:t>Entity</w:t>
+      </w:r>
+      <w:proofErr w:type="spellEnd"/>
+      <w:r>
+        <w:rPr>
+          <w:sz w:val="22"/>
+          <w:szCs w:val="22"/>
+          <w:lang w:val="es-CO"/>
+        </w:rPr>
+        <w:t xml:space="preserve"> Framework Core, y el patrón </w:t>
+      </w:r>
+      <w:proofErr w:type="spellStart"/>
+      <w:r>
+        <w:rPr>
+          <w:sz w:val="22"/>
+          <w:szCs w:val="22"/>
+          <w:lang w:val="es-CO"/>
+        </w:rPr>
+        <w:t>Repository</w:t>
+      </w:r>
+      <w:proofErr w:type="spellEnd"/>
+      <w:r>
+        <w:rPr>
+          <w:sz w:val="22"/>
+          <w:szCs w:val="22"/>
+          <w:lang w:val="es-CO"/>
+        </w:rPr>
+        <w:t>.</w:t>
       </w:r>
     </w:p>
     <w:p>
@@ -8353,7 +9395,43 @@
           <w:szCs w:val="22"/>
           <w:lang w:val="es-CO"/>
         </w:rPr>
-        <w:t> Configuración de bases de datos en la nube (Supabase) y solución de desafíos como CORS y mapeo de DTOs.</w:t>
+        <w:t> Configuración de bases de datos en la nube (</w:t>
+      </w:r>
+      <w:proofErr w:type="spellStart"/>
+      <w:r>
+        <w:rPr>
+          <w:sz w:val="22"/>
+          <w:szCs w:val="22"/>
+          <w:lang w:val="es-CO"/>
+        </w:rPr>
+        <w:t>Supabase</w:t>
+      </w:r>
+      <w:proofErr w:type="spellEnd"/>
+      <w:r>
+        <w:rPr>
+          <w:sz w:val="22"/>
+          <w:szCs w:val="22"/>
+          <w:lang w:val="es-CO"/>
+        </w:rPr>
+        <w:t xml:space="preserve">) y solución de desafíos como CORS y mapeo de </w:t>
+      </w:r>
+      <w:proofErr w:type="spellStart"/>
+      <w:r>
+        <w:rPr>
+          <w:sz w:val="22"/>
+          <w:szCs w:val="22"/>
+          <w:lang w:val="es-CO"/>
+        </w:rPr>
+        <w:t>DTOs</w:t>
+      </w:r>
+      <w:proofErr w:type="spellEnd"/>
+      <w:r>
+        <w:rPr>
+          <w:sz w:val="22"/>
+          <w:szCs w:val="22"/>
+          <w:lang w:val="es-CO"/>
+        </w:rPr>
+        <w:t>.</w:t>
       </w:r>
     </w:p>
     <w:p>
@@ -8443,7 +9521,25 @@
           <w:szCs w:val="22"/>
           <w:lang w:val="es-CO"/>
         </w:rPr>
-        <w:t> Desarrollo para iOS y Android con funcionalidades offline y notificaciones push.</w:t>
+        <w:t xml:space="preserve"> Desarrollo para iOS y Android con funcionalidades offline y notificaciones </w:t>
+      </w:r>
+      <w:proofErr w:type="spellStart"/>
+      <w:r>
+        <w:rPr>
+          <w:sz w:val="22"/>
+          <w:szCs w:val="22"/>
+          <w:lang w:val="es-CO"/>
+        </w:rPr>
+        <w:t>push</w:t>
+      </w:r>
+      <w:proofErr w:type="spellEnd"/>
+      <w:r>
+        <w:rPr>
+          <w:sz w:val="22"/>
+          <w:szCs w:val="22"/>
+          <w:lang w:val="es-CO"/>
+        </w:rPr>
+        <w:t>.</w:t>
       </w:r>
     </w:p>
     <w:p>
@@ -8474,7 +9570,25 @@
           <w:szCs w:val="22"/>
           <w:lang w:val="es-CO"/>
         </w:rPr>
-        <w:t> Para ofrecer una experiencia similar a una app nativa directamente desde el navegador.</w:t>
+        <w:t xml:space="preserve"> Para ofrecer una experiencia similar a una </w:t>
+      </w:r>
+      <w:proofErr w:type="gramStart"/>
+      <w:r>
+        <w:rPr>
+          <w:sz w:val="22"/>
+          <w:szCs w:val="22"/>
+          <w:lang w:val="es-CO"/>
+        </w:rPr>
+        <w:t>app</w:t>
+      </w:r>
+      <w:proofErr w:type="gramEnd"/>
+      <w:r>
+        <w:rPr>
+          <w:sz w:val="22"/>
+          <w:szCs w:val="22"/>
+          <w:lang w:val="es-CO"/>
+        </w:rPr>
+        <w:t xml:space="preserve"> nativa directamente desde el navegador.</w:t>
       </w:r>
     </w:p>
     <w:p>
@@ -8541,15 +9655,27 @@
           <w:lang w:val="es-CO"/>
         </w:rPr>
       </w:pPr>
-      <w:r>
-        <w:rPr>
-          <w:b/>
-          <w:bCs/>
-          <w:sz w:val="22"/>
-          <w:szCs w:val="22"/>
-          <w:lang w:val="es-CO"/>
-        </w:rPr>
-        <w:t>Chatbots Inteligentes:</w:t>
+      <w:proofErr w:type="spellStart"/>
+      <w:r>
+        <w:rPr>
+          <w:b/>
+          <w:bCs/>
+          <w:sz w:val="22"/>
+          <w:szCs w:val="22"/>
+          <w:lang w:val="es-CO"/>
+        </w:rPr>
+        <w:t>Chatbots</w:t>
+      </w:r>
+      <w:proofErr w:type="spellEnd"/>
+      <w:r>
+        <w:rPr>
+          <w:b/>
+          <w:bCs/>
+          <w:sz w:val="22"/>
+          <w:szCs w:val="22"/>
+          <w:lang w:val="es-CO"/>
+        </w:rPr>
+        <w:t xml:space="preserve"> Inteligentes:</w:t>
       </w:r>
       <w:r>
         <w:rPr>
@@ -8640,7 +9766,25 @@
           <w:szCs w:val="22"/>
           <w:lang w:val="es-CO"/>
         </w:rPr>
-        <w:t> Conexión con sistemas como Stripe, PayPal y soluciones locales.</w:t>
+        <w:t xml:space="preserve"> Conexión con sistemas como </w:t>
+      </w:r>
+      <w:proofErr w:type="spellStart"/>
+      <w:r>
+        <w:rPr>
+          <w:sz w:val="22"/>
+          <w:szCs w:val="22"/>
+          <w:lang w:val="es-CO"/>
+        </w:rPr>
+        <w:t>Stripe</w:t>
+      </w:r>
+      <w:proofErr w:type="spellEnd"/>
+      <w:r>
+        <w:rPr>
+          <w:sz w:val="22"/>
+          <w:szCs w:val="22"/>
+          <w:lang w:val="es-CO"/>
+        </w:rPr>
+        <w:t>, PayPal y soluciones locales.</w:t>
       </w:r>
     </w:p>
     <w:p>
@@ -8671,7 +9815,25 @@
           <w:szCs w:val="22"/>
           <w:lang w:val="es-CO"/>
         </w:rPr>
-        <w:t> Integración con APIs de repuestos y Google Maps para una gestión logística mejorada.</w:t>
+        <w:t xml:space="preserve"> Integración con APIs de repuestos y Google </w:t>
+      </w:r>
+      <w:proofErr w:type="spellStart"/>
+      <w:r>
+        <w:rPr>
+          <w:sz w:val="22"/>
+          <w:szCs w:val="22"/>
+          <w:lang w:val="es-CO"/>
+        </w:rPr>
+        <w:t>Maps</w:t>
+      </w:r>
+      <w:proofErr w:type="spellEnd"/>
+      <w:r>
+        <w:rPr>
+          <w:sz w:val="22"/>
+          <w:szCs w:val="22"/>
+          <w:lang w:val="es-CO"/>
+        </w:rPr>
+        <w:t xml:space="preserve"> para una gestión logística mejorada.</w:t>
       </w:r>
     </w:p>
     <w:p>
@@ -8769,15 +9931,27 @@
           <w:lang w:val="es-CO"/>
         </w:rPr>
       </w:pPr>
-      <w:r>
-        <w:rPr>
-          <w:b/>
-          <w:bCs/>
-          <w:sz w:val="22"/>
-          <w:szCs w:val="22"/>
-          <w:lang w:val="es-CO"/>
-        </w:rPr>
-        <w:t>Caching y CDN:</w:t>
+      <w:proofErr w:type="spellStart"/>
+      <w:r>
+        <w:rPr>
+          <w:b/>
+          <w:bCs/>
+          <w:sz w:val="22"/>
+          <w:szCs w:val="22"/>
+          <w:lang w:val="es-CO"/>
+        </w:rPr>
+        <w:t>Caching</w:t>
+      </w:r>
+      <w:proofErr w:type="spellEnd"/>
+      <w:r>
+        <w:rPr>
+          <w:b/>
+          <w:bCs/>
+          <w:sz w:val="22"/>
+          <w:szCs w:val="22"/>
+          <w:lang w:val="es-CO"/>
+        </w:rPr>
+        <w:t xml:space="preserve"> y CDN:</w:t>
       </w:r>
       <w:r>
         <w:rPr>
@@ -8868,7 +10042,25 @@
           <w:szCs w:val="22"/>
           <w:lang w:val="es-CO"/>
         </w:rPr>
-        <w:t> Facilitar interacciones hands-free y visualización de reparaciones.</w:t>
+        <w:t xml:space="preserve"> Facilitar interacciones </w:t>
+      </w:r>
+      <w:proofErr w:type="spellStart"/>
+      <w:r>
+        <w:rPr>
+          <w:sz w:val="22"/>
+          <w:szCs w:val="22"/>
+          <w:lang w:val="es-CO"/>
+        </w:rPr>
+        <w:t>hands</w:t>
+      </w:r>
+      <w:proofErr w:type="spellEnd"/>
+      <w:r>
+        <w:rPr>
+          <w:sz w:val="22"/>
+          <w:szCs w:val="22"/>
+          <w:lang w:val="es-CO"/>
+        </w:rPr>
+        <w:t>-free y visualización de reparaciones.</w:t>
       </w:r>
     </w:p>
     <w:p>
@@ -8975,7 +10167,29 @@
           <w:szCs w:val="22"/>
           <w:lang w:val="es-CO"/>
         </w:rPr>
-        <w:t>Auditoría y Backups Automatizados:</w:t>
+        <w:t xml:space="preserve">Auditoría y </w:t>
+      </w:r>
+      <w:proofErr w:type="spellStart"/>
+      <w:r>
+        <w:rPr>
+          <w:b/>
+          <w:bCs/>
+          <w:sz w:val="22"/>
+          <w:szCs w:val="22"/>
+          <w:lang w:val="es-CO"/>
+        </w:rPr>
+        <w:t>Backups</w:t>
+      </w:r>
+      <w:proofErr w:type="spellEnd"/>
+      <w:r>
+        <w:rPr>
+          <w:b/>
+          <w:bCs/>
+          <w:sz w:val="22"/>
+          <w:szCs w:val="22"/>
+          <w:lang w:val="es-CO"/>
+        </w:rPr>
+        <w:t xml:space="preserve"> Automatizados:</w:t>
       </w:r>
       <w:r>
         <w:rPr>
@@ -9035,8 +10249,42 @@
           <w:szCs w:val="22"/>
           <w:lang w:val="es-CO"/>
         </w:rPr>
-        <w:t>7. Intelligence y Analytics</w:t>
-      </w:r>
+        <w:t xml:space="preserve">7. </w:t>
+      </w:r>
+      <w:proofErr w:type="spellStart"/>
+      <w:r>
+        <w:rPr>
+          <w:b/>
+          <w:bCs/>
+          <w:sz w:val="22"/>
+          <w:szCs w:val="22"/>
+          <w:lang w:val="es-CO"/>
+        </w:rPr>
+        <w:t>Intelligence</w:t>
+      </w:r>
+      <w:proofErr w:type="spellEnd"/>
+      <w:r>
+        <w:rPr>
+          <w:b/>
+          <w:bCs/>
+          <w:sz w:val="22"/>
+          <w:szCs w:val="22"/>
+          <w:lang w:val="es-CO"/>
+        </w:rPr>
+        <w:t xml:space="preserve"> y </w:t>
+      </w:r>
+      <w:proofErr w:type="spellStart"/>
+      <w:r>
+        <w:rPr>
+          <w:b/>
+          <w:bCs/>
+          <w:sz w:val="22"/>
+          <w:szCs w:val="22"/>
+          <w:lang w:val="es-CO"/>
+        </w:rPr>
+        <w:t>Analytics</w:t>
+      </w:r>
+      <w:proofErr w:type="spellEnd"/>
     </w:p>
     <w:p>
       <w:pPr>
@@ -9050,15 +10298,49 @@
           <w:lang w:val="es-CO"/>
         </w:rPr>
       </w:pPr>
-      <w:r>
-        <w:rPr>
-          <w:b/>
-          <w:bCs/>
-          <w:sz w:val="22"/>
-          <w:szCs w:val="22"/>
-          <w:lang w:val="es-CO"/>
-        </w:rPr>
-        <w:t>Dashboards Avanzados y KPIs:</w:t>
+      <w:proofErr w:type="spellStart"/>
+      <w:r>
+        <w:rPr>
+          <w:b/>
+          <w:bCs/>
+          <w:sz w:val="22"/>
+          <w:szCs w:val="22"/>
+          <w:lang w:val="es-CO"/>
+        </w:rPr>
+        <w:t>Dashboards</w:t>
+      </w:r>
+      <w:proofErr w:type="spellEnd"/>
+      <w:r>
+        <w:rPr>
+          <w:b/>
+          <w:bCs/>
+          <w:sz w:val="22"/>
+          <w:szCs w:val="22"/>
+          <w:lang w:val="es-CO"/>
+        </w:rPr>
+        <w:t xml:space="preserve"> Avanzados y </w:t>
+      </w:r>
+      <w:proofErr w:type="spellStart"/>
+      <w:r>
+        <w:rPr>
+          <w:b/>
+          <w:bCs/>
+          <w:sz w:val="22"/>
+          <w:szCs w:val="22"/>
+          <w:lang w:val="es-CO"/>
+        </w:rPr>
+        <w:t>KPIs</w:t>
+      </w:r>
+      <w:proofErr w:type="spellEnd"/>
+      <w:r>
+        <w:rPr>
+          <w:b/>
+          <w:bCs/>
+          <w:sz w:val="22"/>
+          <w:szCs w:val="22"/>
+          <w:lang w:val="es-CO"/>
+        </w:rPr>
+        <w:t>:</w:t>
       </w:r>
       <w:r>
         <w:rPr>
@@ -9089,15 +10371,55 @@
           <w:szCs w:val="22"/>
           <w:lang w:val="es-CO"/>
         </w:rPr>
-        <w:t>Machine Learning para Análisis de Clientes:</w:t>
-      </w:r>
-      <w:r>
-        <w:rPr>
-          <w:sz w:val="22"/>
-          <w:szCs w:val="22"/>
-          <w:lang w:val="es-CO"/>
-        </w:rPr>
-        <w:t> Identificar patrones de comportamiento y optimizar estrategias de engagement.</w:t>
+        <w:t xml:space="preserve">Machine </w:t>
+      </w:r>
+      <w:proofErr w:type="spellStart"/>
+      <w:r>
+        <w:rPr>
+          <w:b/>
+          <w:bCs/>
+          <w:sz w:val="22"/>
+          <w:szCs w:val="22"/>
+          <w:lang w:val="es-CO"/>
+        </w:rPr>
+        <w:t>Learning</w:t>
+      </w:r>
+      <w:proofErr w:type="spellEnd"/>
+      <w:r>
+        <w:rPr>
+          <w:b/>
+          <w:bCs/>
+          <w:sz w:val="22"/>
+          <w:szCs w:val="22"/>
+          <w:lang w:val="es-CO"/>
+        </w:rPr>
+        <w:t xml:space="preserve"> para Análisis de Clientes:</w:t>
+      </w:r>
+      <w:r>
+        <w:rPr>
+          <w:sz w:val="22"/>
+          <w:szCs w:val="22"/>
+          <w:lang w:val="es-CO"/>
+        </w:rPr>
+        <w:t xml:space="preserve"> Identificar patrones de comportamiento y optimizar estrategias de </w:t>
+      </w:r>
+      <w:proofErr w:type="spellStart"/>
+      <w:r>
+        <w:rPr>
+          <w:sz w:val="22"/>
+          <w:szCs w:val="22"/>
+          <w:lang w:val="es-CO"/>
+        </w:rPr>
+        <w:t>engagement</w:t>
+      </w:r>
+      <w:proofErr w:type="spellEnd"/>
+      <w:r>
+        <w:rPr>
+          <w:sz w:val="22"/>
+          <w:szCs w:val="22"/>
+          <w:lang w:val="es-CO"/>
+        </w:rPr>
+        <w:t>.</w:t>
       </w:r>
     </w:p>
     <w:p>
@@ -9141,7 +10463,29 @@
           <w:szCs w:val="22"/>
           <w:lang w:val="es-CO"/>
         </w:rPr>
-        <w:t>Modelo Multi-tenant:</w:t>
+        <w:t xml:space="preserve">Modelo </w:t>
+      </w:r>
+      <w:proofErr w:type="spellStart"/>
+      <w:r>
+        <w:rPr>
+          <w:b/>
+          <w:bCs/>
+          <w:sz w:val="22"/>
+          <w:szCs w:val="22"/>
+          <w:lang w:val="es-CO"/>
+        </w:rPr>
+        <w:t>Multi-tenant</w:t>
+      </w:r>
+      <w:proofErr w:type="spellEnd"/>
+      <w:r>
+        <w:rPr>
+          <w:b/>
+          <w:bCs/>
+          <w:sz w:val="22"/>
+          <w:szCs w:val="22"/>
+          <w:lang w:val="es-CO"/>
+        </w:rPr>
+        <w:t>:</w:t>
       </w:r>
       <w:r>
         <w:rPr>
@@ -9195,6 +10539,10 @@
     <w:sdt>
       <w:sdtPr>
         <w:rPr>
+          <w:rFonts w:asciiTheme="minorHAnsi" w:eastAsiaTheme="minorEastAsia" w:hAnsiTheme="minorHAnsi" w:cstheme="minorBidi"/>
+          <w:color w:val="auto"/>
+          <w:sz w:val="24"/>
+          <w:szCs w:val="24"/>
           <w:lang w:val="es-ES"/>
         </w:rPr>
         <w:id w:val="-1713949768"/>
@@ -9205,10 +10553,6 @@
       </w:sdtPr>
       <w:sdtEndPr>
         <w:rPr>
-          <w:rFonts w:asciiTheme="minorHAnsi" w:eastAsiaTheme="minorEastAsia" w:hAnsiTheme="minorHAnsi" w:cstheme="minorBidi"/>
-          <w:color w:val="auto"/>
-          <w:sz w:val="24"/>
-          <w:szCs w:val="24"/>
           <w:lang w:val="en-US"/>
         </w:rPr>
       </w:sdtEndPr>
@@ -14372,6 +15716,7 @@
   <w:style w:type="character" w:default="1" w:styleId="Fuentedeprrafopredeter">
     <w:name w:val="Default Paragraph Font"/>
     <w:uiPriority w:val="1"/>
+    <w:semiHidden/>
     <w:unhideWhenUsed/>
   </w:style>
   <w:style w:type="table" w:default="1" w:styleId="Tablanormal">

</xml_diff>